<commit_message>
Retire tirets longs de l'audit
audit-avant-apres.docx regenere avec le contenu de la version retouchee
(ligne du site de reference retiree, titres sans tiret) et sans aucun
tiret long, y compris dans les images des fiches de code.

Co-Authored-By: Claude Opus 5.5 <noreply@anthropic.com>
</commit_message>
<xml_diff>
--- a/audit/audit-avant-apres.docx
+++ b/audit/audit-avant-apres.docx
@@ -14,7 +14,7 @@
         <w:rPr>
           <w:rFonts w:ascii="Calibri" w:eastAsia="Times New Roman" w:hAnsi="Calibri" w:cs="Calibri"/>
         </w:rPr>
-        <w:t>Audit de performance — avant / après</w:t>
+        <w:t>Audit de performance : avant / après</w:t>
       </w:r>
     </w:p>
     <w:p>
@@ -45,7 +45,7 @@
           <w:sz w:val="22"/>
           <w:szCs w:val="22"/>
         </w:rPr>
-        <w:t xml:space="preserve"> Soane ILOAI — BUT MMI Béziers — TP R3.14</w:t>
+        <w:t xml:space="preserve"> Soane ILOAI, BUT MMI Béziers, TP R3.14</w:t>
       </w:r>
     </w:p>
     <w:p>
@@ -129,48 +129,6 @@
             <w:szCs w:val="22"/>
           </w:rPr>
           <w:t>https://github.com/Soane986/R314-optimisation-site</w:t>
-        </w:r>
-      </w:hyperlink>
-    </w:p>
-    <w:p>
-      <w:pPr>
-        <w:pStyle w:val="NormalWeb"/>
-        <w:rPr>
-          <w:rFonts w:ascii="Calibri" w:hAnsi="Calibri" w:cs="Calibri"/>
-          <w:color w:val="1D2130"/>
-          <w:sz w:val="22"/>
-          <w:szCs w:val="22"/>
-        </w:rPr>
-      </w:pPr>
-      <w:r>
-        <w:rPr>
-          <w:rFonts w:ascii="Calibri" w:hAnsi="Calibri" w:cs="Calibri"/>
-          <w:b/>
-          <w:bCs/>
-          <w:color w:val="1D2130"/>
-          <w:sz w:val="22"/>
-          <w:szCs w:val="22"/>
-        </w:rPr>
-        <w:t>Site de référence (avant) :</w:t>
-      </w:r>
-      <w:r>
-        <w:rPr>
-          <w:rFonts w:ascii="Calibri" w:hAnsi="Calibri" w:cs="Calibri"/>
-          <w:color w:val="1D2130"/>
-          <w:sz w:val="22"/>
-          <w:szCs w:val="22"/>
-        </w:rPr>
-        <w:t xml:space="preserve"> </w:t>
-      </w:r>
-      <w:hyperlink r:id="rId6" w:history="1">
-        <w:r>
-          <w:rPr>
-            <w:rStyle w:val="Lienhypertexte"/>
-            <w:rFonts w:ascii="Calibri" w:hAnsi="Calibri" w:cs="Calibri"/>
-            <w:sz w:val="22"/>
-            <w:szCs w:val="22"/>
-          </w:rPr>
-          <w:t>https://nico3807.github.io/R314-optimisation-site/</w:t>
         </w:r>
       </w:hyperlink>
     </w:p>
@@ -390,7 +348,7 @@
                 <w:sz w:val="22"/>
                 <w:szCs w:val="22"/>
               </w:rPr>
-              <w:t>Score Performance — mobile</w:t>
+              <w:t>Score Performance (mobile)</w:t>
             </w:r>
           </w:p>
         </w:tc>
@@ -507,7 +465,7 @@
                 <w:sz w:val="22"/>
                 <w:szCs w:val="22"/>
               </w:rPr>
-              <w:t>Score Performance — desktop</w:t>
+              <w:t>Score Performance (desktop)</w:t>
             </w:r>
           </w:p>
         </w:tc>
@@ -1540,7 +1498,7 @@
           <w:rFonts w:ascii="Calibri" w:eastAsia="Times New Roman" w:hAnsi="Calibri" w:cs="Calibri"/>
         </w:rPr>
         <w:lastRenderedPageBreak/>
-        <w:t>2. PageSpeed Insights — mobile</w:t>
+        <w:t>2. PageSpeed Insights mobile</w:t>
       </w:r>
     </w:p>
     <w:tbl>
@@ -1599,7 +1557,7 @@
                 <w:szCs w:val="22"/>
               </w:rPr>
               <w:drawing>
-                <wp:inline distT="0" distB="0" distL="0" distR="0" wp14:anchorId="479AE9EE" wp14:editId="3C2C70C2">
+                <wp:inline distT="0" distB="0" distL="0" distR="0" wp14:anchorId="1F1702C0" wp14:editId="6205896A">
                   <wp:extent cx="2857500" cy="3550920"/>
                   <wp:effectExtent l="0" t="0" r="0" b="0"/>
                   <wp:docPr id="1" name="Image 1"/>
@@ -1611,6 +1569,107 @@
                       <pic:pic xmlns:pic="http://schemas.openxmlformats.org/drawingml/2006/picture">
                         <pic:nvPicPr>
                           <pic:cNvPr id="0" name="Picture 1"/>
+                          <pic:cNvPicPr>
+                            <a:picLocks noChangeAspect="1" noChangeArrowheads="1"/>
+                          </pic:cNvPicPr>
+                        </pic:nvPicPr>
+                        <pic:blipFill>
+                          <a:blip r:embed="rId6" cstate="print">
+                            <a:extLst>
+                              <a:ext uri="{28A0092B-C50C-407E-A947-70E740481C1C}">
+                                <a14:useLocalDpi xmlns:a14="http://schemas.microsoft.com/office/drawing/2010/main" val="0"/>
+                              </a:ext>
+                            </a:extLst>
+                          </a:blip>
+                          <a:srcRect/>
+                          <a:stretch>
+                            <a:fillRect/>
+                          </a:stretch>
+                        </pic:blipFill>
+                        <pic:spPr bwMode="auto">
+                          <a:xfrm>
+                            <a:off x="0" y="0"/>
+                            <a:ext cx="2857500" cy="3550920"/>
+                          </a:xfrm>
+                          <a:prstGeom prst="rect">
+                            <a:avLst/>
+                          </a:prstGeom>
+                          <a:noFill/>
+                          <a:ln>
+                            <a:noFill/>
+                          </a:ln>
+                        </pic:spPr>
+                      </pic:pic>
+                    </a:graphicData>
+                  </a:graphic>
+                </wp:inline>
+              </w:drawing>
+            </w:r>
+          </w:p>
+          <w:p>
+            <w:pPr>
+              <w:pStyle w:val="leg"/>
+              <w:rPr>
+                <w:rFonts w:ascii="Calibri" w:hAnsi="Calibri" w:cs="Calibri"/>
+              </w:rPr>
+            </w:pPr>
+            <w:r>
+              <w:rPr>
+                <w:rFonts w:ascii="Calibri" w:hAnsi="Calibri" w:cs="Calibri"/>
+              </w:rPr>
+              <w:t>Avant : score 61, LCP 67,1 s</w:t>
+            </w:r>
+          </w:p>
+        </w:tc>
+        <w:tc>
+          <w:tcPr>
+            <w:tcW w:w="0" w:type="auto"/>
+            <w:tcBorders>
+              <w:top w:val="nil"/>
+              <w:left w:val="nil"/>
+              <w:bottom w:val="nil"/>
+              <w:right w:val="nil"/>
+            </w:tcBorders>
+            <w:tcMar>
+              <w:top w:w="40" w:type="dxa"/>
+              <w:left w:w="40" w:type="dxa"/>
+              <w:bottom w:w="40" w:type="dxa"/>
+              <w:right w:w="40" w:type="dxa"/>
+            </w:tcMar>
+            <w:hideMark/>
+          </w:tcPr>
+          <w:p>
+            <w:pPr>
+              <w:keepNext/>
+              <w:jc w:val="center"/>
+              <w:rPr>
+                <w:rFonts w:ascii="Calibri" w:eastAsia="Times New Roman" w:hAnsi="Calibri" w:cs="Calibri"/>
+                <w:color w:val="1D2130"/>
+                <w:sz w:val="22"/>
+                <w:szCs w:val="22"/>
+              </w:rPr>
+            </w:pPr>
+            <w:r>
+              <w:rPr>
+                <w:rFonts w:ascii="Calibri" w:eastAsia="Times New Roman" w:hAnsi="Calibri" w:cs="Calibri"/>
+                <w:noProof/>
+                <w:color w:val="1D2130"/>
+                <w:sz w:val="22"/>
+                <w:szCs w:val="22"/>
+              </w:rPr>
+              <w:drawing>
+                <wp:inline distT="0" distB="0" distL="0" distR="0" wp14:anchorId="06843447" wp14:editId="72989127">
+                  <wp:extent cx="2857500" cy="3550920"/>
+                  <wp:effectExtent l="0" t="0" r="0" b="0"/>
+                  <wp:docPr id="2" name="Image 2"/>
+                  <wp:cNvGraphicFramePr>
+                    <a:graphicFrameLocks xmlns:a="http://schemas.openxmlformats.org/drawingml/2006/main" noChangeAspect="1"/>
+                  </wp:cNvGraphicFramePr>
+                  <a:graphic xmlns:a="http://schemas.openxmlformats.org/drawingml/2006/main">
+                    <a:graphicData uri="http://schemas.openxmlformats.org/drawingml/2006/picture">
+                      <pic:pic xmlns:pic="http://schemas.openxmlformats.org/drawingml/2006/picture">
+                        <pic:nvPicPr>
+                          <pic:cNvPr id="0" name="Picture 2"/>
                           <pic:cNvPicPr>
                             <a:picLocks noChangeAspect="1" noChangeArrowheads="1"/>
                           </pic:cNvPicPr>
@@ -1659,108 +1718,7 @@
               <w:rPr>
                 <w:rFonts w:ascii="Calibri" w:hAnsi="Calibri" w:cs="Calibri"/>
               </w:rPr>
-              <w:t>Avant — score 61, LCP 67,1 s</w:t>
-            </w:r>
-          </w:p>
-        </w:tc>
-        <w:tc>
-          <w:tcPr>
-            <w:tcW w:w="0" w:type="auto"/>
-            <w:tcBorders>
-              <w:top w:val="nil"/>
-              <w:left w:val="nil"/>
-              <w:bottom w:val="nil"/>
-              <w:right w:val="nil"/>
-            </w:tcBorders>
-            <w:tcMar>
-              <w:top w:w="40" w:type="dxa"/>
-              <w:left w:w="40" w:type="dxa"/>
-              <w:bottom w:w="40" w:type="dxa"/>
-              <w:right w:w="40" w:type="dxa"/>
-            </w:tcMar>
-            <w:hideMark/>
-          </w:tcPr>
-          <w:p>
-            <w:pPr>
-              <w:keepNext/>
-              <w:jc w:val="center"/>
-              <w:rPr>
-                <w:rFonts w:ascii="Calibri" w:eastAsia="Times New Roman" w:hAnsi="Calibri" w:cs="Calibri"/>
-                <w:color w:val="1D2130"/>
-                <w:sz w:val="22"/>
-                <w:szCs w:val="22"/>
-              </w:rPr>
-            </w:pPr>
-            <w:r>
-              <w:rPr>
-                <w:rFonts w:ascii="Calibri" w:eastAsia="Times New Roman" w:hAnsi="Calibri" w:cs="Calibri"/>
-                <w:noProof/>
-                <w:color w:val="1D2130"/>
-                <w:sz w:val="22"/>
-                <w:szCs w:val="22"/>
-              </w:rPr>
-              <w:drawing>
-                <wp:inline distT="0" distB="0" distL="0" distR="0" wp14:anchorId="1F7463F0" wp14:editId="2F2511E6">
-                  <wp:extent cx="2857500" cy="3550920"/>
-                  <wp:effectExtent l="0" t="0" r="0" b="0"/>
-                  <wp:docPr id="2" name="Image 2"/>
-                  <wp:cNvGraphicFramePr>
-                    <a:graphicFrameLocks xmlns:a="http://schemas.openxmlformats.org/drawingml/2006/main" noChangeAspect="1"/>
-                  </wp:cNvGraphicFramePr>
-                  <a:graphic xmlns:a="http://schemas.openxmlformats.org/drawingml/2006/main">
-                    <a:graphicData uri="http://schemas.openxmlformats.org/drawingml/2006/picture">
-                      <pic:pic xmlns:pic="http://schemas.openxmlformats.org/drawingml/2006/picture">
-                        <pic:nvPicPr>
-                          <pic:cNvPr id="0" name="Picture 2"/>
-                          <pic:cNvPicPr>
-                            <a:picLocks noChangeAspect="1" noChangeArrowheads="1"/>
-                          </pic:cNvPicPr>
-                        </pic:nvPicPr>
-                        <pic:blipFill>
-                          <a:blip r:embed="rId8" cstate="print">
-                            <a:extLst>
-                              <a:ext uri="{28A0092B-C50C-407E-A947-70E740481C1C}">
-                                <a14:useLocalDpi xmlns:a14="http://schemas.microsoft.com/office/drawing/2010/main" val="0"/>
-                              </a:ext>
-                            </a:extLst>
-                          </a:blip>
-                          <a:srcRect/>
-                          <a:stretch>
-                            <a:fillRect/>
-                          </a:stretch>
-                        </pic:blipFill>
-                        <pic:spPr bwMode="auto">
-                          <a:xfrm>
-                            <a:off x="0" y="0"/>
-                            <a:ext cx="2857500" cy="3550920"/>
-                          </a:xfrm>
-                          <a:prstGeom prst="rect">
-                            <a:avLst/>
-                          </a:prstGeom>
-                          <a:noFill/>
-                          <a:ln>
-                            <a:noFill/>
-                          </a:ln>
-                        </pic:spPr>
-                      </pic:pic>
-                    </a:graphicData>
-                  </a:graphic>
-                </wp:inline>
-              </w:drawing>
-            </w:r>
-          </w:p>
-          <w:p>
-            <w:pPr>
-              <w:pStyle w:val="leg"/>
-              <w:rPr>
-                <w:rFonts w:ascii="Calibri" w:hAnsi="Calibri" w:cs="Calibri"/>
-              </w:rPr>
-            </w:pPr>
-            <w:r>
-              <w:rPr>
-                <w:rFonts w:ascii="Calibri" w:hAnsi="Calibri" w:cs="Calibri"/>
-              </w:rPr>
-              <w:t>Après — score 89, LCP 3,0 s</w:t>
+              <w:t>Après : score 89, LCP 3,0 s</w:t>
             </w:r>
           </w:p>
         </w:tc>
@@ -1778,7 +1736,7 @@
         <w:rPr>
           <w:rFonts w:ascii="Calibri" w:eastAsia="Times New Roman" w:hAnsi="Calibri" w:cs="Calibri"/>
         </w:rPr>
-        <w:t>3. PageSpeed Insights — desktop</w:t>
+        <w:t>3. PageSpeed Insights desktop</w:t>
       </w:r>
     </w:p>
     <w:tbl>
@@ -1837,7 +1795,7 @@
                 <w:szCs w:val="22"/>
               </w:rPr>
               <w:drawing>
-                <wp:inline distT="0" distB="0" distL="0" distR="0" wp14:anchorId="3257BF1F" wp14:editId="3ECBE536">
+                <wp:inline distT="0" distB="0" distL="0" distR="0" wp14:anchorId="6E928D64" wp14:editId="2ADCC5AF">
                   <wp:extent cx="2857500" cy="3550920"/>
                   <wp:effectExtent l="0" t="0" r="0" b="0"/>
                   <wp:docPr id="3" name="Image 3"/>
@@ -1849,6 +1807,107 @@
                       <pic:pic xmlns:pic="http://schemas.openxmlformats.org/drawingml/2006/picture">
                         <pic:nvPicPr>
                           <pic:cNvPr id="0" name="Picture 3"/>
+                          <pic:cNvPicPr>
+                            <a:picLocks noChangeAspect="1" noChangeArrowheads="1"/>
+                          </pic:cNvPicPr>
+                        </pic:nvPicPr>
+                        <pic:blipFill>
+                          <a:blip r:embed="rId8" cstate="print">
+                            <a:extLst>
+                              <a:ext uri="{28A0092B-C50C-407E-A947-70E740481C1C}">
+                                <a14:useLocalDpi xmlns:a14="http://schemas.microsoft.com/office/drawing/2010/main" val="0"/>
+                              </a:ext>
+                            </a:extLst>
+                          </a:blip>
+                          <a:srcRect/>
+                          <a:stretch>
+                            <a:fillRect/>
+                          </a:stretch>
+                        </pic:blipFill>
+                        <pic:spPr bwMode="auto">
+                          <a:xfrm>
+                            <a:off x="0" y="0"/>
+                            <a:ext cx="2857500" cy="3550920"/>
+                          </a:xfrm>
+                          <a:prstGeom prst="rect">
+                            <a:avLst/>
+                          </a:prstGeom>
+                          <a:noFill/>
+                          <a:ln>
+                            <a:noFill/>
+                          </a:ln>
+                        </pic:spPr>
+                      </pic:pic>
+                    </a:graphicData>
+                  </a:graphic>
+                </wp:inline>
+              </w:drawing>
+            </w:r>
+          </w:p>
+          <w:p>
+            <w:pPr>
+              <w:pStyle w:val="leg"/>
+              <w:rPr>
+                <w:rFonts w:ascii="Calibri" w:hAnsi="Calibri" w:cs="Calibri"/>
+              </w:rPr>
+            </w:pPr>
+            <w:r>
+              <w:rPr>
+                <w:rFonts w:ascii="Calibri" w:hAnsi="Calibri" w:cs="Calibri"/>
+              </w:rPr>
+              <w:t>Avant : score 52, TBT 320 ms</w:t>
+            </w:r>
+          </w:p>
+        </w:tc>
+        <w:tc>
+          <w:tcPr>
+            <w:tcW w:w="0" w:type="auto"/>
+            <w:tcBorders>
+              <w:top w:val="nil"/>
+              <w:left w:val="nil"/>
+              <w:bottom w:val="nil"/>
+              <w:right w:val="nil"/>
+            </w:tcBorders>
+            <w:tcMar>
+              <w:top w:w="40" w:type="dxa"/>
+              <w:left w:w="40" w:type="dxa"/>
+              <w:bottom w:w="40" w:type="dxa"/>
+              <w:right w:w="40" w:type="dxa"/>
+            </w:tcMar>
+            <w:hideMark/>
+          </w:tcPr>
+          <w:p>
+            <w:pPr>
+              <w:keepNext/>
+              <w:jc w:val="center"/>
+              <w:rPr>
+                <w:rFonts w:ascii="Calibri" w:eastAsia="Times New Roman" w:hAnsi="Calibri" w:cs="Calibri"/>
+                <w:color w:val="1D2130"/>
+                <w:sz w:val="22"/>
+                <w:szCs w:val="22"/>
+              </w:rPr>
+            </w:pPr>
+            <w:r>
+              <w:rPr>
+                <w:rFonts w:ascii="Calibri" w:eastAsia="Times New Roman" w:hAnsi="Calibri" w:cs="Calibri"/>
+                <w:noProof/>
+                <w:color w:val="1D2130"/>
+                <w:sz w:val="22"/>
+                <w:szCs w:val="22"/>
+              </w:rPr>
+              <w:drawing>
+                <wp:inline distT="0" distB="0" distL="0" distR="0" wp14:anchorId="4E625C3E" wp14:editId="1D2EE390">
+                  <wp:extent cx="2857500" cy="3550920"/>
+                  <wp:effectExtent l="0" t="0" r="0" b="0"/>
+                  <wp:docPr id="4" name="Image 4"/>
+                  <wp:cNvGraphicFramePr>
+                    <a:graphicFrameLocks xmlns:a="http://schemas.openxmlformats.org/drawingml/2006/main" noChangeAspect="1"/>
+                  </wp:cNvGraphicFramePr>
+                  <a:graphic xmlns:a="http://schemas.openxmlformats.org/drawingml/2006/main">
+                    <a:graphicData uri="http://schemas.openxmlformats.org/drawingml/2006/picture">
+                      <pic:pic xmlns:pic="http://schemas.openxmlformats.org/drawingml/2006/picture">
+                        <pic:nvPicPr>
+                          <pic:cNvPr id="0" name="Picture 4"/>
                           <pic:cNvPicPr>
                             <a:picLocks noChangeAspect="1" noChangeArrowheads="1"/>
                           </pic:cNvPicPr>
@@ -1897,108 +1956,7 @@
               <w:rPr>
                 <w:rFonts w:ascii="Calibri" w:hAnsi="Calibri" w:cs="Calibri"/>
               </w:rPr>
-              <w:t>Avant — score 52, TBT 320 ms</w:t>
-            </w:r>
-          </w:p>
-        </w:tc>
-        <w:tc>
-          <w:tcPr>
-            <w:tcW w:w="0" w:type="auto"/>
-            <w:tcBorders>
-              <w:top w:val="nil"/>
-              <w:left w:val="nil"/>
-              <w:bottom w:val="nil"/>
-              <w:right w:val="nil"/>
-            </w:tcBorders>
-            <w:tcMar>
-              <w:top w:w="40" w:type="dxa"/>
-              <w:left w:w="40" w:type="dxa"/>
-              <w:bottom w:w="40" w:type="dxa"/>
-              <w:right w:w="40" w:type="dxa"/>
-            </w:tcMar>
-            <w:hideMark/>
-          </w:tcPr>
-          <w:p>
-            <w:pPr>
-              <w:keepNext/>
-              <w:jc w:val="center"/>
-              <w:rPr>
-                <w:rFonts w:ascii="Calibri" w:eastAsia="Times New Roman" w:hAnsi="Calibri" w:cs="Calibri"/>
-                <w:color w:val="1D2130"/>
-                <w:sz w:val="22"/>
-                <w:szCs w:val="22"/>
-              </w:rPr>
-            </w:pPr>
-            <w:r>
-              <w:rPr>
-                <w:rFonts w:ascii="Calibri" w:eastAsia="Times New Roman" w:hAnsi="Calibri" w:cs="Calibri"/>
-                <w:noProof/>
-                <w:color w:val="1D2130"/>
-                <w:sz w:val="22"/>
-                <w:szCs w:val="22"/>
-              </w:rPr>
-              <w:drawing>
-                <wp:inline distT="0" distB="0" distL="0" distR="0" wp14:anchorId="54E3C285" wp14:editId="0BCC7C5E">
-                  <wp:extent cx="2857500" cy="3550920"/>
-                  <wp:effectExtent l="0" t="0" r="0" b="0"/>
-                  <wp:docPr id="4" name="Image 4"/>
-                  <wp:cNvGraphicFramePr>
-                    <a:graphicFrameLocks xmlns:a="http://schemas.openxmlformats.org/drawingml/2006/main" noChangeAspect="1"/>
-                  </wp:cNvGraphicFramePr>
-                  <a:graphic xmlns:a="http://schemas.openxmlformats.org/drawingml/2006/main">
-                    <a:graphicData uri="http://schemas.openxmlformats.org/drawingml/2006/picture">
-                      <pic:pic xmlns:pic="http://schemas.openxmlformats.org/drawingml/2006/picture">
-                        <pic:nvPicPr>
-                          <pic:cNvPr id="0" name="Picture 4"/>
-                          <pic:cNvPicPr>
-                            <a:picLocks noChangeAspect="1" noChangeArrowheads="1"/>
-                          </pic:cNvPicPr>
-                        </pic:nvPicPr>
-                        <pic:blipFill>
-                          <a:blip r:embed="rId10" cstate="print">
-                            <a:extLst>
-                              <a:ext uri="{28A0092B-C50C-407E-A947-70E740481C1C}">
-                                <a14:useLocalDpi xmlns:a14="http://schemas.microsoft.com/office/drawing/2010/main" val="0"/>
-                              </a:ext>
-                            </a:extLst>
-                          </a:blip>
-                          <a:srcRect/>
-                          <a:stretch>
-                            <a:fillRect/>
-                          </a:stretch>
-                        </pic:blipFill>
-                        <pic:spPr bwMode="auto">
-                          <a:xfrm>
-                            <a:off x="0" y="0"/>
-                            <a:ext cx="2857500" cy="3550920"/>
-                          </a:xfrm>
-                          <a:prstGeom prst="rect">
-                            <a:avLst/>
-                          </a:prstGeom>
-                          <a:noFill/>
-                          <a:ln>
-                            <a:noFill/>
-                          </a:ln>
-                        </pic:spPr>
-                      </pic:pic>
-                    </a:graphicData>
-                  </a:graphic>
-                </wp:inline>
-              </w:drawing>
-            </w:r>
-          </w:p>
-          <w:p>
-            <w:pPr>
-              <w:pStyle w:val="leg"/>
-              <w:rPr>
-                <w:rFonts w:ascii="Calibri" w:hAnsi="Calibri" w:cs="Calibri"/>
-              </w:rPr>
-            </w:pPr>
-            <w:r>
-              <w:rPr>
-                <w:rFonts w:ascii="Calibri" w:hAnsi="Calibri" w:cs="Calibri"/>
-              </w:rPr>
-              <w:t>Après — score 100, TBT 0 ms</w:t>
+              <w:t>Après : score 100, TBT 0 ms</w:t>
             </w:r>
           </w:p>
         </w:tc>
@@ -2052,7 +2010,7 @@
           <w:rFonts w:ascii="Calibri" w:eastAsia="Times New Roman" w:hAnsi="Calibri" w:cs="Calibri"/>
         </w:rPr>
         <w:lastRenderedPageBreak/>
-        <w:t>Accueil — desktop (1280 px)</w:t>
+        <w:t>Accueil desktop (1280 px)</w:t>
       </w:r>
     </w:p>
     <w:p>
@@ -2076,7 +2034,7 @@
           <w:szCs w:val="22"/>
         </w:rPr>
         <w:drawing>
-          <wp:inline distT="0" distB="0" distL="0" distR="0" wp14:anchorId="5EDB48A6" wp14:editId="446EB5C6">
+          <wp:inline distT="0" distB="0" distL="0" distR="0" wp14:anchorId="0B58D24B" wp14:editId="14F6DE23">
             <wp:extent cx="5715000" cy="3573780"/>
             <wp:effectExtent l="0" t="0" r="0" b="7620"/>
             <wp:docPr id="5" name="Image 5"/>
@@ -2088,6 +2046,90 @@
                 <pic:pic xmlns:pic="http://schemas.openxmlformats.org/drawingml/2006/picture">
                   <pic:nvPicPr>
                     <pic:cNvPr id="0" name="Picture 5"/>
+                    <pic:cNvPicPr>
+                      <a:picLocks noChangeAspect="1" noChangeArrowheads="1"/>
+                    </pic:cNvPicPr>
+                  </pic:nvPicPr>
+                  <pic:blipFill>
+                    <a:blip r:embed="rId10">
+                      <a:extLst>
+                        <a:ext uri="{28A0092B-C50C-407E-A947-70E740481C1C}">
+                          <a14:useLocalDpi xmlns:a14="http://schemas.microsoft.com/office/drawing/2010/main" val="0"/>
+                        </a:ext>
+                      </a:extLst>
+                    </a:blip>
+                    <a:srcRect/>
+                    <a:stretch>
+                      <a:fillRect/>
+                    </a:stretch>
+                  </pic:blipFill>
+                  <pic:spPr bwMode="auto">
+                    <a:xfrm>
+                      <a:off x="0" y="0"/>
+                      <a:ext cx="5715000" cy="3573780"/>
+                    </a:xfrm>
+                    <a:prstGeom prst="rect">
+                      <a:avLst/>
+                    </a:prstGeom>
+                    <a:noFill/>
+                    <a:ln>
+                      <a:noFill/>
+                    </a:ln>
+                  </pic:spPr>
+                </pic:pic>
+              </a:graphicData>
+            </a:graphic>
+          </wp:inline>
+        </w:drawing>
+      </w:r>
+    </w:p>
+    <w:p>
+      <w:pPr>
+        <w:pStyle w:val="leg"/>
+        <w:rPr>
+          <w:rFonts w:ascii="Calibri" w:hAnsi="Calibri" w:cs="Calibri"/>
+        </w:rPr>
+      </w:pPr>
+      <w:r>
+        <w:rPr>
+          <w:rFonts w:ascii="Calibri" w:hAnsi="Calibri" w:cs="Calibri"/>
+        </w:rPr>
+        <w:t>Avant</w:t>
+      </w:r>
+    </w:p>
+    <w:p>
+      <w:pPr>
+        <w:pStyle w:val="NormalWeb"/>
+        <w:keepNext/>
+        <w:jc w:val="center"/>
+        <w:rPr>
+          <w:rFonts w:ascii="Calibri" w:hAnsi="Calibri" w:cs="Calibri"/>
+          <w:color w:val="1D2130"/>
+          <w:sz w:val="22"/>
+          <w:szCs w:val="22"/>
+        </w:rPr>
+      </w:pPr>
+      <w:r>
+        <w:rPr>
+          <w:rFonts w:ascii="Calibri" w:hAnsi="Calibri" w:cs="Calibri"/>
+          <w:noProof/>
+          <w:color w:val="1D2130"/>
+          <w:sz w:val="22"/>
+          <w:szCs w:val="22"/>
+        </w:rPr>
+        <w:drawing>
+          <wp:inline distT="0" distB="0" distL="0" distR="0" wp14:anchorId="2AD43649" wp14:editId="6793F3A6">
+            <wp:extent cx="5715000" cy="3573780"/>
+            <wp:effectExtent l="0" t="0" r="0" b="7620"/>
+            <wp:docPr id="6" name="Image 6"/>
+            <wp:cNvGraphicFramePr>
+              <a:graphicFrameLocks xmlns:a="http://schemas.openxmlformats.org/drawingml/2006/main" noChangeAspect="1"/>
+            </wp:cNvGraphicFramePr>
+            <a:graphic xmlns:a="http://schemas.openxmlformats.org/drawingml/2006/main">
+              <a:graphicData uri="http://schemas.openxmlformats.org/drawingml/2006/picture">
+                <pic:pic xmlns:pic="http://schemas.openxmlformats.org/drawingml/2006/picture">
+                  <pic:nvPicPr>
+                    <pic:cNvPr id="0" name="Picture 6"/>
                     <pic:cNvPicPr>
                       <a:picLocks noChangeAspect="1" noChangeArrowheads="1"/>
                     </pic:cNvPicPr>
@@ -2136,91 +2178,7 @@
         <w:rPr>
           <w:rFonts w:ascii="Calibri" w:hAnsi="Calibri" w:cs="Calibri"/>
         </w:rPr>
-        <w:t>Avant</w:t>
-      </w:r>
-    </w:p>
-    <w:p>
-      <w:pPr>
-        <w:pStyle w:val="NormalWeb"/>
-        <w:keepNext/>
-        <w:jc w:val="center"/>
-        <w:rPr>
-          <w:rFonts w:ascii="Calibri" w:hAnsi="Calibri" w:cs="Calibri"/>
-          <w:color w:val="1D2130"/>
-          <w:sz w:val="22"/>
-          <w:szCs w:val="22"/>
-        </w:rPr>
-      </w:pPr>
-      <w:r>
-        <w:rPr>
-          <w:rFonts w:ascii="Calibri" w:hAnsi="Calibri" w:cs="Calibri"/>
-          <w:noProof/>
-          <w:color w:val="1D2130"/>
-          <w:sz w:val="22"/>
-          <w:szCs w:val="22"/>
-        </w:rPr>
-        <w:drawing>
-          <wp:inline distT="0" distB="0" distL="0" distR="0" wp14:anchorId="2BBB88D1" wp14:editId="44C9B2AE">
-            <wp:extent cx="5715000" cy="3573780"/>
-            <wp:effectExtent l="0" t="0" r="0" b="7620"/>
-            <wp:docPr id="6" name="Image 6"/>
-            <wp:cNvGraphicFramePr>
-              <a:graphicFrameLocks xmlns:a="http://schemas.openxmlformats.org/drawingml/2006/main" noChangeAspect="1"/>
-            </wp:cNvGraphicFramePr>
-            <a:graphic xmlns:a="http://schemas.openxmlformats.org/drawingml/2006/main">
-              <a:graphicData uri="http://schemas.openxmlformats.org/drawingml/2006/picture">
-                <pic:pic xmlns:pic="http://schemas.openxmlformats.org/drawingml/2006/picture">
-                  <pic:nvPicPr>
-                    <pic:cNvPr id="0" name="Picture 6"/>
-                    <pic:cNvPicPr>
-                      <a:picLocks noChangeAspect="1" noChangeArrowheads="1"/>
-                    </pic:cNvPicPr>
-                  </pic:nvPicPr>
-                  <pic:blipFill>
-                    <a:blip r:embed="rId12">
-                      <a:extLst>
-                        <a:ext uri="{28A0092B-C50C-407E-A947-70E740481C1C}">
-                          <a14:useLocalDpi xmlns:a14="http://schemas.microsoft.com/office/drawing/2010/main" val="0"/>
-                        </a:ext>
-                      </a:extLst>
-                    </a:blip>
-                    <a:srcRect/>
-                    <a:stretch>
-                      <a:fillRect/>
-                    </a:stretch>
-                  </pic:blipFill>
-                  <pic:spPr bwMode="auto">
-                    <a:xfrm>
-                      <a:off x="0" y="0"/>
-                      <a:ext cx="5715000" cy="3573780"/>
-                    </a:xfrm>
-                    <a:prstGeom prst="rect">
-                      <a:avLst/>
-                    </a:prstGeom>
-                    <a:noFill/>
-                    <a:ln>
-                      <a:noFill/>
-                    </a:ln>
-                  </pic:spPr>
-                </pic:pic>
-              </a:graphicData>
-            </a:graphic>
-          </wp:inline>
-        </w:drawing>
-      </w:r>
-    </w:p>
-    <w:p>
-      <w:pPr>
-        <w:pStyle w:val="leg"/>
-        <w:rPr>
-          <w:rFonts w:ascii="Calibri" w:hAnsi="Calibri" w:cs="Calibri"/>
-        </w:rPr>
-      </w:pPr>
-      <w:r>
-        <w:rPr>
-          <w:rFonts w:ascii="Calibri" w:hAnsi="Calibri" w:cs="Calibri"/>
-        </w:rPr>
-        <w:t>Après — identique</w:t>
+        <w:t>Après : identique</w:t>
       </w:r>
     </w:p>
     <w:p>
@@ -2236,7 +2194,7 @@
           <w:rFonts w:ascii="Calibri" w:eastAsia="Times New Roman" w:hAnsi="Calibri" w:cs="Calibri"/>
         </w:rPr>
         <w:lastRenderedPageBreak/>
-        <w:t>Accueil — mobile (412 px)</w:t>
+        <w:t>Accueil mobile (412 px)</w:t>
       </w:r>
     </w:p>
     <w:tbl>
@@ -2295,7 +2253,7 @@
                 <w:szCs w:val="22"/>
               </w:rPr>
               <w:drawing>
-                <wp:inline distT="0" distB="0" distL="0" distR="0" wp14:anchorId="478BB6EA" wp14:editId="39939CA5">
+                <wp:inline distT="0" distB="0" distL="0" distR="0" wp14:anchorId="0E65E38F" wp14:editId="626F0F84">
                   <wp:extent cx="2194560" cy="4777740"/>
                   <wp:effectExtent l="0" t="0" r="0" b="3810"/>
                   <wp:docPr id="7" name="Image 7"/>
@@ -2307,6 +2265,107 @@
                       <pic:pic xmlns:pic="http://schemas.openxmlformats.org/drawingml/2006/picture">
                         <pic:nvPicPr>
                           <pic:cNvPr id="0" name="Picture 7"/>
+                          <pic:cNvPicPr>
+                            <a:picLocks noChangeAspect="1" noChangeArrowheads="1"/>
+                          </pic:cNvPicPr>
+                        </pic:nvPicPr>
+                        <pic:blipFill>
+                          <a:blip r:embed="rId12">
+                            <a:extLst>
+                              <a:ext uri="{28A0092B-C50C-407E-A947-70E740481C1C}">
+                                <a14:useLocalDpi xmlns:a14="http://schemas.microsoft.com/office/drawing/2010/main" val="0"/>
+                              </a:ext>
+                            </a:extLst>
+                          </a:blip>
+                          <a:srcRect/>
+                          <a:stretch>
+                            <a:fillRect/>
+                          </a:stretch>
+                        </pic:blipFill>
+                        <pic:spPr bwMode="auto">
+                          <a:xfrm>
+                            <a:off x="0" y="0"/>
+                            <a:ext cx="2194560" cy="4777740"/>
+                          </a:xfrm>
+                          <a:prstGeom prst="rect">
+                            <a:avLst/>
+                          </a:prstGeom>
+                          <a:noFill/>
+                          <a:ln>
+                            <a:noFill/>
+                          </a:ln>
+                        </pic:spPr>
+                      </pic:pic>
+                    </a:graphicData>
+                  </a:graphic>
+                </wp:inline>
+              </w:drawing>
+            </w:r>
+          </w:p>
+          <w:p>
+            <w:pPr>
+              <w:pStyle w:val="leg"/>
+              <w:rPr>
+                <w:rFonts w:ascii="Calibri" w:hAnsi="Calibri" w:cs="Calibri"/>
+              </w:rPr>
+            </w:pPr>
+            <w:r>
+              <w:rPr>
+                <w:rFonts w:ascii="Calibri" w:hAnsi="Calibri" w:cs="Calibri"/>
+              </w:rPr>
+              <w:t>Avant</w:t>
+            </w:r>
+          </w:p>
+        </w:tc>
+        <w:tc>
+          <w:tcPr>
+            <w:tcW w:w="0" w:type="auto"/>
+            <w:tcBorders>
+              <w:top w:val="nil"/>
+              <w:left w:val="nil"/>
+              <w:bottom w:val="nil"/>
+              <w:right w:val="nil"/>
+            </w:tcBorders>
+            <w:tcMar>
+              <w:top w:w="40" w:type="dxa"/>
+              <w:left w:w="40" w:type="dxa"/>
+              <w:bottom w:w="40" w:type="dxa"/>
+              <w:right w:w="40" w:type="dxa"/>
+            </w:tcMar>
+            <w:hideMark/>
+          </w:tcPr>
+          <w:p>
+            <w:pPr>
+              <w:keepNext/>
+              <w:jc w:val="center"/>
+              <w:rPr>
+                <w:rFonts w:ascii="Calibri" w:eastAsia="Times New Roman" w:hAnsi="Calibri" w:cs="Calibri"/>
+                <w:color w:val="1D2130"/>
+                <w:sz w:val="22"/>
+                <w:szCs w:val="22"/>
+              </w:rPr>
+            </w:pPr>
+            <w:r>
+              <w:rPr>
+                <w:rFonts w:ascii="Calibri" w:eastAsia="Times New Roman" w:hAnsi="Calibri" w:cs="Calibri"/>
+                <w:noProof/>
+                <w:color w:val="1D2130"/>
+                <w:sz w:val="22"/>
+                <w:szCs w:val="22"/>
+              </w:rPr>
+              <w:drawing>
+                <wp:inline distT="0" distB="0" distL="0" distR="0" wp14:anchorId="6AB78280" wp14:editId="557DD58E">
+                  <wp:extent cx="2194560" cy="4777740"/>
+                  <wp:effectExtent l="0" t="0" r="0" b="3810"/>
+                  <wp:docPr id="8" name="Image 8"/>
+                  <wp:cNvGraphicFramePr>
+                    <a:graphicFrameLocks xmlns:a="http://schemas.openxmlformats.org/drawingml/2006/main" noChangeAspect="1"/>
+                  </wp:cNvGraphicFramePr>
+                  <a:graphic xmlns:a="http://schemas.openxmlformats.org/drawingml/2006/main">
+                    <a:graphicData uri="http://schemas.openxmlformats.org/drawingml/2006/picture">
+                      <pic:pic xmlns:pic="http://schemas.openxmlformats.org/drawingml/2006/picture">
+                        <pic:nvPicPr>
+                          <pic:cNvPr id="0" name="Picture 8"/>
                           <pic:cNvPicPr>
                             <a:picLocks noChangeAspect="1" noChangeArrowheads="1"/>
                           </pic:cNvPicPr>
@@ -2355,108 +2414,7 @@
               <w:rPr>
                 <w:rFonts w:ascii="Calibri" w:hAnsi="Calibri" w:cs="Calibri"/>
               </w:rPr>
-              <w:t>Avant</w:t>
-            </w:r>
-          </w:p>
-        </w:tc>
-        <w:tc>
-          <w:tcPr>
-            <w:tcW w:w="0" w:type="auto"/>
-            <w:tcBorders>
-              <w:top w:val="nil"/>
-              <w:left w:val="nil"/>
-              <w:bottom w:val="nil"/>
-              <w:right w:val="nil"/>
-            </w:tcBorders>
-            <w:tcMar>
-              <w:top w:w="40" w:type="dxa"/>
-              <w:left w:w="40" w:type="dxa"/>
-              <w:bottom w:w="40" w:type="dxa"/>
-              <w:right w:w="40" w:type="dxa"/>
-            </w:tcMar>
-            <w:hideMark/>
-          </w:tcPr>
-          <w:p>
-            <w:pPr>
-              <w:keepNext/>
-              <w:jc w:val="center"/>
-              <w:rPr>
-                <w:rFonts w:ascii="Calibri" w:eastAsia="Times New Roman" w:hAnsi="Calibri" w:cs="Calibri"/>
-                <w:color w:val="1D2130"/>
-                <w:sz w:val="22"/>
-                <w:szCs w:val="22"/>
-              </w:rPr>
-            </w:pPr>
-            <w:r>
-              <w:rPr>
-                <w:rFonts w:ascii="Calibri" w:eastAsia="Times New Roman" w:hAnsi="Calibri" w:cs="Calibri"/>
-                <w:noProof/>
-                <w:color w:val="1D2130"/>
-                <w:sz w:val="22"/>
-                <w:szCs w:val="22"/>
-              </w:rPr>
-              <w:drawing>
-                <wp:inline distT="0" distB="0" distL="0" distR="0" wp14:anchorId="330E0DC4" wp14:editId="15D8EF69">
-                  <wp:extent cx="2194560" cy="4777740"/>
-                  <wp:effectExtent l="0" t="0" r="0" b="3810"/>
-                  <wp:docPr id="8" name="Image 8"/>
-                  <wp:cNvGraphicFramePr>
-                    <a:graphicFrameLocks xmlns:a="http://schemas.openxmlformats.org/drawingml/2006/main" noChangeAspect="1"/>
-                  </wp:cNvGraphicFramePr>
-                  <a:graphic xmlns:a="http://schemas.openxmlformats.org/drawingml/2006/main">
-                    <a:graphicData uri="http://schemas.openxmlformats.org/drawingml/2006/picture">
-                      <pic:pic xmlns:pic="http://schemas.openxmlformats.org/drawingml/2006/picture">
-                        <pic:nvPicPr>
-                          <pic:cNvPr id="0" name="Picture 8"/>
-                          <pic:cNvPicPr>
-                            <a:picLocks noChangeAspect="1" noChangeArrowheads="1"/>
-                          </pic:cNvPicPr>
-                        </pic:nvPicPr>
-                        <pic:blipFill>
-                          <a:blip r:embed="rId14">
-                            <a:extLst>
-                              <a:ext uri="{28A0092B-C50C-407E-A947-70E740481C1C}">
-                                <a14:useLocalDpi xmlns:a14="http://schemas.microsoft.com/office/drawing/2010/main" val="0"/>
-                              </a:ext>
-                            </a:extLst>
-                          </a:blip>
-                          <a:srcRect/>
-                          <a:stretch>
-                            <a:fillRect/>
-                          </a:stretch>
-                        </pic:blipFill>
-                        <pic:spPr bwMode="auto">
-                          <a:xfrm>
-                            <a:off x="0" y="0"/>
-                            <a:ext cx="2194560" cy="4777740"/>
-                          </a:xfrm>
-                          <a:prstGeom prst="rect">
-                            <a:avLst/>
-                          </a:prstGeom>
-                          <a:noFill/>
-                          <a:ln>
-                            <a:noFill/>
-                          </a:ln>
-                        </pic:spPr>
-                      </pic:pic>
-                    </a:graphicData>
-                  </a:graphic>
-                </wp:inline>
-              </w:drawing>
-            </w:r>
-          </w:p>
-          <w:p>
-            <w:pPr>
-              <w:pStyle w:val="leg"/>
-              <w:rPr>
-                <w:rFonts w:ascii="Calibri" w:hAnsi="Calibri" w:cs="Calibri"/>
-              </w:rPr>
-            </w:pPr>
-            <w:r>
-              <w:rPr>
-                <w:rFonts w:ascii="Calibri" w:hAnsi="Calibri" w:cs="Calibri"/>
-              </w:rPr>
-              <w:t>Après — identique</w:t>
+              <w:t>Après : identique</w:t>
             </w:r>
           </w:p>
         </w:tc>
@@ -2476,7 +2434,7 @@
           <w:rFonts w:ascii="Calibri" w:eastAsia="Times New Roman" w:hAnsi="Calibri" w:cs="Calibri"/>
         </w:rPr>
         <w:lastRenderedPageBreak/>
-        <w:t>Page de détail — mobile (412 px) : seule différence volontaire</w:t>
+        <w:t>Page de détail mobile (412 px) : seule différence volontaire</w:t>
       </w:r>
     </w:p>
     <w:tbl>
@@ -2491,8 +2449,8 @@
         <w:tblLook w:val="04A0" w:firstRow="1" w:lastRow="0" w:firstColumn="1" w:lastColumn="0" w:noHBand="0" w:noVBand="1"/>
       </w:tblPr>
       <w:tblGrid>
-        <w:gridCol w:w="5626"/>
-        <w:gridCol w:w="4281"/>
+        <w:gridCol w:w="5642"/>
+        <w:gridCol w:w="4265"/>
       </w:tblGrid>
       <w:tr>
         <w:trPr>
@@ -2535,7 +2493,7 @@
                 <w:szCs w:val="22"/>
               </w:rPr>
               <w:drawing>
-                <wp:inline distT="0" distB="0" distL="0" distR="0" wp14:anchorId="648DF7E9" wp14:editId="5F568CF2">
+                <wp:inline distT="0" distB="0" distL="0" distR="0" wp14:anchorId="7DDE6887" wp14:editId="3D0EB724">
                   <wp:extent cx="2194560" cy="3726180"/>
                   <wp:effectExtent l="0" t="0" r="0" b="7620"/>
                   <wp:docPr id="9" name="Image 9"/>
@@ -2547,6 +2505,107 @@
                       <pic:pic xmlns:pic="http://schemas.openxmlformats.org/drawingml/2006/picture">
                         <pic:nvPicPr>
                           <pic:cNvPr id="0" name="Picture 9"/>
+                          <pic:cNvPicPr>
+                            <a:picLocks noChangeAspect="1" noChangeArrowheads="1"/>
+                          </pic:cNvPicPr>
+                        </pic:nvPicPr>
+                        <pic:blipFill>
+                          <a:blip r:embed="rId14">
+                            <a:extLst>
+                              <a:ext uri="{28A0092B-C50C-407E-A947-70E740481C1C}">
+                                <a14:useLocalDpi xmlns:a14="http://schemas.microsoft.com/office/drawing/2010/main" val="0"/>
+                              </a:ext>
+                            </a:extLst>
+                          </a:blip>
+                          <a:srcRect/>
+                          <a:stretch>
+                            <a:fillRect/>
+                          </a:stretch>
+                        </pic:blipFill>
+                        <pic:spPr bwMode="auto">
+                          <a:xfrm>
+                            <a:off x="0" y="0"/>
+                            <a:ext cx="2194560" cy="3726180"/>
+                          </a:xfrm>
+                          <a:prstGeom prst="rect">
+                            <a:avLst/>
+                          </a:prstGeom>
+                          <a:noFill/>
+                          <a:ln>
+                            <a:noFill/>
+                          </a:ln>
+                        </pic:spPr>
+                      </pic:pic>
+                    </a:graphicData>
+                  </a:graphic>
+                </wp:inline>
+              </w:drawing>
+            </w:r>
+          </w:p>
+          <w:p>
+            <w:pPr>
+              <w:pStyle w:val="leg"/>
+              <w:rPr>
+                <w:rFonts w:ascii="Calibri" w:hAnsi="Calibri" w:cs="Calibri"/>
+              </w:rPr>
+            </w:pPr>
+            <w:r>
+              <w:rPr>
+                <w:rFonts w:ascii="Calibri" w:hAnsi="Calibri" w:cs="Calibri"/>
+              </w:rPr>
+              <w:t>Avant : photo de 2040 px affichée en taille native : elle déborde de l'écran</w:t>
+            </w:r>
+          </w:p>
+        </w:tc>
+        <w:tc>
+          <w:tcPr>
+            <w:tcW w:w="0" w:type="auto"/>
+            <w:tcBorders>
+              <w:top w:val="nil"/>
+              <w:left w:val="nil"/>
+              <w:bottom w:val="nil"/>
+              <w:right w:val="nil"/>
+            </w:tcBorders>
+            <w:tcMar>
+              <w:top w:w="40" w:type="dxa"/>
+              <w:left w:w="40" w:type="dxa"/>
+              <w:bottom w:w="40" w:type="dxa"/>
+              <w:right w:w="40" w:type="dxa"/>
+            </w:tcMar>
+            <w:hideMark/>
+          </w:tcPr>
+          <w:p>
+            <w:pPr>
+              <w:keepNext/>
+              <w:jc w:val="center"/>
+              <w:rPr>
+                <w:rFonts w:ascii="Calibri" w:eastAsia="Times New Roman" w:hAnsi="Calibri" w:cs="Calibri"/>
+                <w:color w:val="1D2130"/>
+                <w:sz w:val="22"/>
+                <w:szCs w:val="22"/>
+              </w:rPr>
+            </w:pPr>
+            <w:r>
+              <w:rPr>
+                <w:rFonts w:ascii="Calibri" w:eastAsia="Times New Roman" w:hAnsi="Calibri" w:cs="Calibri"/>
+                <w:noProof/>
+                <w:color w:val="1D2130"/>
+                <w:sz w:val="22"/>
+                <w:szCs w:val="22"/>
+              </w:rPr>
+              <w:drawing>
+                <wp:inline distT="0" distB="0" distL="0" distR="0" wp14:anchorId="0249E589" wp14:editId="6B5B624E">
+                  <wp:extent cx="2194560" cy="3726180"/>
+                  <wp:effectExtent l="0" t="0" r="0" b="7620"/>
+                  <wp:docPr id="10" name="Image 10"/>
+                  <wp:cNvGraphicFramePr>
+                    <a:graphicFrameLocks xmlns:a="http://schemas.openxmlformats.org/drawingml/2006/main" noChangeAspect="1"/>
+                  </wp:cNvGraphicFramePr>
+                  <a:graphic xmlns:a="http://schemas.openxmlformats.org/drawingml/2006/main">
+                    <a:graphicData uri="http://schemas.openxmlformats.org/drawingml/2006/picture">
+                      <pic:pic xmlns:pic="http://schemas.openxmlformats.org/drawingml/2006/picture">
+                        <pic:nvPicPr>
+                          <pic:cNvPr id="0" name="Picture 10"/>
                           <pic:cNvPicPr>
                             <a:picLocks noChangeAspect="1" noChangeArrowheads="1"/>
                           </pic:cNvPicPr>
@@ -2595,108 +2654,7 @@
               <w:rPr>
                 <w:rFonts w:ascii="Calibri" w:hAnsi="Calibri" w:cs="Calibri"/>
               </w:rPr>
-              <w:t>Avant — photo de 2040 px affichée en taille native : elle déborde de l'écran</w:t>
-            </w:r>
-          </w:p>
-        </w:tc>
-        <w:tc>
-          <w:tcPr>
-            <w:tcW w:w="0" w:type="auto"/>
-            <w:tcBorders>
-              <w:top w:val="nil"/>
-              <w:left w:val="nil"/>
-              <w:bottom w:val="nil"/>
-              <w:right w:val="nil"/>
-            </w:tcBorders>
-            <w:tcMar>
-              <w:top w:w="40" w:type="dxa"/>
-              <w:left w:w="40" w:type="dxa"/>
-              <w:bottom w:w="40" w:type="dxa"/>
-              <w:right w:w="40" w:type="dxa"/>
-            </w:tcMar>
-            <w:hideMark/>
-          </w:tcPr>
-          <w:p>
-            <w:pPr>
-              <w:keepNext/>
-              <w:jc w:val="center"/>
-              <w:rPr>
-                <w:rFonts w:ascii="Calibri" w:eastAsia="Times New Roman" w:hAnsi="Calibri" w:cs="Calibri"/>
-                <w:color w:val="1D2130"/>
-                <w:sz w:val="22"/>
-                <w:szCs w:val="22"/>
-              </w:rPr>
-            </w:pPr>
-            <w:r>
-              <w:rPr>
-                <w:rFonts w:ascii="Calibri" w:eastAsia="Times New Roman" w:hAnsi="Calibri" w:cs="Calibri"/>
-                <w:noProof/>
-                <w:color w:val="1D2130"/>
-                <w:sz w:val="22"/>
-                <w:szCs w:val="22"/>
-              </w:rPr>
-              <w:drawing>
-                <wp:inline distT="0" distB="0" distL="0" distR="0" wp14:anchorId="210FAAF1" wp14:editId="3D53B09C">
-                  <wp:extent cx="2194560" cy="3726180"/>
-                  <wp:effectExtent l="0" t="0" r="0" b="7620"/>
-                  <wp:docPr id="10" name="Image 10"/>
-                  <wp:cNvGraphicFramePr>
-                    <a:graphicFrameLocks xmlns:a="http://schemas.openxmlformats.org/drawingml/2006/main" noChangeAspect="1"/>
-                  </wp:cNvGraphicFramePr>
-                  <a:graphic xmlns:a="http://schemas.openxmlformats.org/drawingml/2006/main">
-                    <a:graphicData uri="http://schemas.openxmlformats.org/drawingml/2006/picture">
-                      <pic:pic xmlns:pic="http://schemas.openxmlformats.org/drawingml/2006/picture">
-                        <pic:nvPicPr>
-                          <pic:cNvPr id="0" name="Picture 10"/>
-                          <pic:cNvPicPr>
-                            <a:picLocks noChangeAspect="1" noChangeArrowheads="1"/>
-                          </pic:cNvPicPr>
-                        </pic:nvPicPr>
-                        <pic:blipFill>
-                          <a:blip r:embed="rId16">
-                            <a:extLst>
-                              <a:ext uri="{28A0092B-C50C-407E-A947-70E740481C1C}">
-                                <a14:useLocalDpi xmlns:a14="http://schemas.microsoft.com/office/drawing/2010/main" val="0"/>
-                              </a:ext>
-                            </a:extLst>
-                          </a:blip>
-                          <a:srcRect/>
-                          <a:stretch>
-                            <a:fillRect/>
-                          </a:stretch>
-                        </pic:blipFill>
-                        <pic:spPr bwMode="auto">
-                          <a:xfrm>
-                            <a:off x="0" y="0"/>
-                            <a:ext cx="2194560" cy="3726180"/>
-                          </a:xfrm>
-                          <a:prstGeom prst="rect">
-                            <a:avLst/>
-                          </a:prstGeom>
-                          <a:noFill/>
-                          <a:ln>
-                            <a:noFill/>
-                          </a:ln>
-                        </pic:spPr>
-                      </pic:pic>
-                    </a:graphicData>
-                  </a:graphic>
-                </wp:inline>
-              </w:drawing>
-            </w:r>
-          </w:p>
-          <w:p>
-            <w:pPr>
-              <w:pStyle w:val="leg"/>
-              <w:rPr>
-                <w:rFonts w:ascii="Calibri" w:hAnsi="Calibri" w:cs="Calibri"/>
-              </w:rPr>
-            </w:pPr>
-            <w:r>
-              <w:rPr>
-                <w:rFonts w:ascii="Calibri" w:hAnsi="Calibri" w:cs="Calibri"/>
-              </w:rPr>
-              <w:t>Après — photo contenue dans la page (max-width:100%)</w:t>
+              <w:t>Après : photo contenue dans la page (max-width:100%)</w:t>
             </w:r>
           </w:p>
         </w:tc>
@@ -2757,7 +2715,7 @@
           <w:szCs w:val="22"/>
         </w:rPr>
         <w:drawing>
-          <wp:inline distT="0" distB="0" distL="0" distR="0" wp14:anchorId="190B2948" wp14:editId="4C8197FE">
+          <wp:inline distT="0" distB="0" distL="0" distR="0" wp14:anchorId="1A4E1B12" wp14:editId="2F47FA7C">
             <wp:extent cx="5905500" cy="1775460"/>
             <wp:effectExtent l="0" t="0" r="0" b="0"/>
             <wp:docPr id="11" name="Image 11"/>
@@ -2774,7 +2732,7 @@
                     </pic:cNvPicPr>
                   </pic:nvPicPr>
                   <pic:blipFill>
-                    <a:blip r:embed="rId17">
+                    <a:blip r:embed="rId16">
                       <a:extLst>
                         <a:ext uri="{28A0092B-C50C-407E-A947-70E740481C1C}">
                           <a14:useLocalDpi xmlns:a14="http://schemas.microsoft.com/office/drawing/2010/main" val="0"/>
@@ -2826,7 +2784,7 @@
           <w:szCs w:val="22"/>
         </w:rPr>
         <w:drawing>
-          <wp:inline distT="0" distB="0" distL="0" distR="0" wp14:anchorId="71CCFE46" wp14:editId="6536243A">
+          <wp:inline distT="0" distB="0" distL="0" distR="0" wp14:anchorId="32FF7E9A" wp14:editId="177FC5A4">
             <wp:extent cx="5905500" cy="2026920"/>
             <wp:effectExtent l="0" t="0" r="0" b="0"/>
             <wp:docPr id="12" name="Image 12"/>
@@ -2843,7 +2801,7 @@
                     </pic:cNvPicPr>
                   </pic:nvPicPr>
                   <pic:blipFill>
-                    <a:blip r:embed="rId18">
+                    <a:blip r:embed="rId17">
                       <a:extLst>
                         <a:ext uri="{28A0092B-C50C-407E-A947-70E740481C1C}">
                           <a14:useLocalDpi xmlns:a14="http://schemas.microsoft.com/office/drawing/2010/main" val="0"/>
@@ -2896,7 +2854,7 @@
         </w:rPr>
         <w:lastRenderedPageBreak/>
         <w:drawing>
-          <wp:inline distT="0" distB="0" distL="0" distR="0" wp14:anchorId="20594AC2" wp14:editId="21F14ED6">
+          <wp:inline distT="0" distB="0" distL="0" distR="0" wp14:anchorId="7A08AC0C" wp14:editId="2F7DA7EE">
             <wp:extent cx="5905500" cy="2103120"/>
             <wp:effectExtent l="0" t="0" r="0" b="0"/>
             <wp:docPr id="13" name="Image 13"/>
@@ -2913,7 +2871,7 @@
                     </pic:cNvPicPr>
                   </pic:nvPicPr>
                   <pic:blipFill>
-                    <a:blip r:embed="rId19">
+                    <a:blip r:embed="rId18">
                       <a:extLst>
                         <a:ext uri="{28A0092B-C50C-407E-A947-70E740481C1C}">
                           <a14:useLocalDpi xmlns:a14="http://schemas.microsoft.com/office/drawing/2010/main" val="0"/>
@@ -2965,7 +2923,7 @@
           <w:szCs w:val="22"/>
         </w:rPr>
         <w:drawing>
-          <wp:inline distT="0" distB="0" distL="0" distR="0" wp14:anchorId="38893D13" wp14:editId="0A404E46">
+          <wp:inline distT="0" distB="0" distL="0" distR="0" wp14:anchorId="2F6CF8DA" wp14:editId="275D84B5">
             <wp:extent cx="5905500" cy="1859280"/>
             <wp:effectExtent l="0" t="0" r="0" b="7620"/>
             <wp:docPr id="14" name="Image 14"/>
@@ -2982,7 +2940,7 @@
                     </pic:cNvPicPr>
                   </pic:nvPicPr>
                   <pic:blipFill>
-                    <a:blip r:embed="rId20">
+                    <a:blip r:embed="rId19">
                       <a:extLst>
                         <a:ext uri="{28A0092B-C50C-407E-A947-70E740481C1C}">
                           <a14:useLocalDpi xmlns:a14="http://schemas.microsoft.com/office/drawing/2010/main" val="0"/>
@@ -3034,7 +2992,7 @@
           <w:szCs w:val="22"/>
         </w:rPr>
         <w:drawing>
-          <wp:inline distT="0" distB="0" distL="0" distR="0" wp14:anchorId="7C9CFEFF" wp14:editId="18E78C5D">
+          <wp:inline distT="0" distB="0" distL="0" distR="0" wp14:anchorId="7169F18E" wp14:editId="76FD54F3">
             <wp:extent cx="5905500" cy="2194560"/>
             <wp:effectExtent l="0" t="0" r="0" b="0"/>
             <wp:docPr id="15" name="Image 15"/>
@@ -3051,7 +3009,7 @@
                     </pic:cNvPicPr>
                   </pic:nvPicPr>
                   <pic:blipFill>
-                    <a:blip r:embed="rId21">
+                    <a:blip r:embed="rId20">
                       <a:extLst>
                         <a:ext uri="{28A0092B-C50C-407E-A947-70E740481C1C}">
                           <a14:useLocalDpi xmlns:a14="http://schemas.microsoft.com/office/drawing/2010/main" val="0"/>
@@ -3103,7 +3061,7 @@
           <w:szCs w:val="22"/>
         </w:rPr>
         <w:drawing>
-          <wp:inline distT="0" distB="0" distL="0" distR="0" wp14:anchorId="54171DFF" wp14:editId="0325D8E9">
+          <wp:inline distT="0" distB="0" distL="0" distR="0" wp14:anchorId="1CE5AD6C" wp14:editId="232E4903">
             <wp:extent cx="5905500" cy="2522220"/>
             <wp:effectExtent l="0" t="0" r="0" b="0"/>
             <wp:docPr id="16" name="Image 16"/>
@@ -3120,7 +3078,7 @@
                     </pic:cNvPicPr>
                   </pic:nvPicPr>
                   <pic:blipFill>
-                    <a:blip r:embed="rId22">
+                    <a:blip r:embed="rId21">
                       <a:extLst>
                         <a:ext uri="{28A0092B-C50C-407E-A947-70E740481C1C}">
                           <a14:useLocalDpi xmlns:a14="http://schemas.microsoft.com/office/drawing/2010/main" val="0"/>
@@ -3173,7 +3131,7 @@
         </w:rPr>
         <w:lastRenderedPageBreak/>
         <w:drawing>
-          <wp:inline distT="0" distB="0" distL="0" distR="0" wp14:anchorId="4CE234BD" wp14:editId="40433465">
+          <wp:inline distT="0" distB="0" distL="0" distR="0" wp14:anchorId="15B27F17" wp14:editId="55C77E66">
             <wp:extent cx="5905500" cy="1691640"/>
             <wp:effectExtent l="0" t="0" r="0" b="3810"/>
             <wp:docPr id="17" name="Image 17"/>
@@ -3190,7 +3148,7 @@
                     </pic:cNvPicPr>
                   </pic:nvPicPr>
                   <pic:blipFill>
-                    <a:blip r:embed="rId23">
+                    <a:blip r:embed="rId22">
                       <a:extLst>
                         <a:ext uri="{28A0092B-C50C-407E-A947-70E740481C1C}">
                           <a14:useLocalDpi xmlns:a14="http://schemas.microsoft.com/office/drawing/2010/main" val="0"/>
@@ -3242,7 +3200,7 @@
           <w:szCs w:val="22"/>
         </w:rPr>
         <w:drawing>
-          <wp:inline distT="0" distB="0" distL="0" distR="0" wp14:anchorId="40A72425" wp14:editId="1EA8F9F1">
+          <wp:inline distT="0" distB="0" distL="0" distR="0" wp14:anchorId="677F4467" wp14:editId="1C9282FD">
             <wp:extent cx="5905500" cy="2278380"/>
             <wp:effectExtent l="0" t="0" r="0" b="7620"/>
             <wp:docPr id="18" name="Image 18"/>
@@ -3259,7 +3217,7 @@
                     </pic:cNvPicPr>
                   </pic:nvPicPr>
                   <pic:blipFill>
-                    <a:blip r:embed="rId24">
+                    <a:blip r:embed="rId23">
                       <a:extLst>
                         <a:ext uri="{28A0092B-C50C-407E-A947-70E740481C1C}">
                           <a14:useLocalDpi xmlns:a14="http://schemas.microsoft.com/office/drawing/2010/main" val="0"/>
@@ -3311,7 +3269,7 @@
           <w:szCs w:val="22"/>
         </w:rPr>
         <w:drawing>
-          <wp:inline distT="0" distB="0" distL="0" distR="0" wp14:anchorId="3090B0F5" wp14:editId="5CB8935C">
+          <wp:inline distT="0" distB="0" distL="0" distR="0" wp14:anchorId="1DEE80A6" wp14:editId="1F2BD4C2">
             <wp:extent cx="5905500" cy="2026920"/>
             <wp:effectExtent l="0" t="0" r="0" b="0"/>
             <wp:docPr id="19" name="Image 19"/>
@@ -3328,7 +3286,7 @@
                     </pic:cNvPicPr>
                   </pic:nvPicPr>
                   <pic:blipFill>
-                    <a:blip r:embed="rId25">
+                    <a:blip r:embed="rId24">
                       <a:extLst>
                         <a:ext uri="{28A0092B-C50C-407E-A947-70E740481C1C}">
                           <a14:useLocalDpi xmlns:a14="http://schemas.microsoft.com/office/drawing/2010/main" val="0"/>
@@ -3380,7 +3338,7 @@
           <w:szCs w:val="22"/>
         </w:rPr>
         <w:drawing>
-          <wp:inline distT="0" distB="0" distL="0" distR="0" wp14:anchorId="1BA589CE" wp14:editId="2B69902B">
+          <wp:inline distT="0" distB="0" distL="0" distR="0" wp14:anchorId="20C76CEF" wp14:editId="75496EDC">
             <wp:extent cx="5905500" cy="1691640"/>
             <wp:effectExtent l="0" t="0" r="0" b="3810"/>
             <wp:docPr id="20" name="Image 20"/>
@@ -3397,7 +3355,7 @@
                     </pic:cNvPicPr>
                   </pic:nvPicPr>
                   <pic:blipFill>
-                    <a:blip r:embed="rId26">
+                    <a:blip r:embed="rId25">
                       <a:extLst>
                         <a:ext uri="{28A0092B-C50C-407E-A947-70E740481C1C}">
                           <a14:useLocalDpi xmlns:a14="http://schemas.microsoft.com/office/drawing/2010/main" val="0"/>

</xml_diff>

<commit_message>
Supprime plusieurs fichiers d'images inutilies
</commit_message>
<xml_diff>
--- a/audit/audit-avant-apres.docx
+++ b/audit/audit-avant-apres.docx
@@ -98,6 +98,7 @@
           <w:color w:val="1D2130"/>
           <w:sz w:val="22"/>
           <w:szCs w:val="22"/>
+          <w:lang w:val="en-US"/>
         </w:rPr>
       </w:pPr>
       <w:r>
@@ -108,6 +109,7 @@
           <w:color w:val="1D2130"/>
           <w:sz w:val="22"/>
           <w:szCs w:val="22"/>
+          <w:lang w:val="en-US"/>
         </w:rPr>
         <w:t>Fork :</w:t>
       </w:r>
@@ -117,6 +119,7 @@
           <w:color w:val="1D2130"/>
           <w:sz w:val="22"/>
           <w:szCs w:val="22"/>
+          <w:lang w:val="en-US"/>
         </w:rPr>
         <w:t xml:space="preserve"> </w:t>
       </w:r>
@@ -127,6 +130,7 @@
             <w:rFonts w:ascii="Calibri" w:hAnsi="Calibri" w:cs="Calibri"/>
             <w:sz w:val="22"/>
             <w:szCs w:val="22"/>
+            <w:lang w:val="en-US"/>
           </w:rPr>
           <w:t>https://github.com/Soane986/R314-optimisation-site</w:t>
         </w:r>
@@ -149,7 +153,27 @@
           <w:sz w:val="22"/>
           <w:szCs w:val="22"/>
         </w:rPr>
-        <w:t>Mesures du 25 octobre 2026. PageSpeed Insights (Lighthouse 13.5.0) : 3 analyses par site et par profil, médiane retenue. Les captures ci-dessous sont celles de l'analyse médiane.</w:t>
+        <w:t xml:space="preserve">Mesures du 25 octobre 2026. </w:t>
+      </w:r>
+      <w:proofErr w:type="spellStart"/>
+      <w:r>
+        <w:rPr>
+          <w:rFonts w:ascii="Calibri" w:hAnsi="Calibri" w:cs="Calibri"/>
+          <w:color w:val="1D2130"/>
+          <w:sz w:val="22"/>
+          <w:szCs w:val="22"/>
+        </w:rPr>
+        <w:t>PageSpeed</w:t>
+      </w:r>
+      <w:proofErr w:type="spellEnd"/>
+      <w:r>
+        <w:rPr>
+          <w:rFonts w:ascii="Calibri" w:hAnsi="Calibri" w:cs="Calibri"/>
+          <w:color w:val="1D2130"/>
+          <w:sz w:val="22"/>
+          <w:szCs w:val="22"/>
+        </w:rPr>
+        <w:t xml:space="preserve"> Insights (Lighthouse 13.5.0) : 3 analyses par site et par profil, médiane retenue. Les captures ci-dessous sont celles de l'analyse médiane.</w:t>
       </w:r>
     </w:p>
     <w:p>
@@ -1498,7 +1522,21 @@
           <w:rFonts w:ascii="Calibri" w:eastAsia="Times New Roman" w:hAnsi="Calibri" w:cs="Calibri"/>
         </w:rPr>
         <w:lastRenderedPageBreak/>
-        <w:t>2. PageSpeed Insights mobile</w:t>
+        <w:t xml:space="preserve">2. </w:t>
+      </w:r>
+      <w:proofErr w:type="spellStart"/>
+      <w:r>
+        <w:rPr>
+          <w:rFonts w:ascii="Calibri" w:eastAsia="Times New Roman" w:hAnsi="Calibri" w:cs="Calibri"/>
+        </w:rPr>
+        <w:t>PageSpeed</w:t>
+      </w:r>
+      <w:proofErr w:type="spellEnd"/>
+      <w:r>
+        <w:rPr>
+          <w:rFonts w:ascii="Calibri" w:eastAsia="Times New Roman" w:hAnsi="Calibri" w:cs="Calibri"/>
+        </w:rPr>
+        <w:t xml:space="preserve"> Insights mobile</w:t>
       </w:r>
     </w:p>
     <w:tbl>
@@ -1736,7 +1774,21 @@
         <w:rPr>
           <w:rFonts w:ascii="Calibri" w:eastAsia="Times New Roman" w:hAnsi="Calibri" w:cs="Calibri"/>
         </w:rPr>
-        <w:t>3. PageSpeed Insights desktop</w:t>
+        <w:t xml:space="preserve">3. </w:t>
+      </w:r>
+      <w:proofErr w:type="spellStart"/>
+      <w:r>
+        <w:rPr>
+          <w:rFonts w:ascii="Calibri" w:eastAsia="Times New Roman" w:hAnsi="Calibri" w:cs="Calibri"/>
+        </w:rPr>
+        <w:t>PageSpeed</w:t>
+      </w:r>
+      <w:proofErr w:type="spellEnd"/>
+      <w:r>
+        <w:rPr>
+          <w:rFonts w:ascii="Calibri" w:eastAsia="Times New Roman" w:hAnsi="Calibri" w:cs="Calibri"/>
+        </w:rPr>
+        <w:t xml:space="preserve"> Insights desktop</w:t>
       </w:r>
     </w:p>
     <w:tbl>
@@ -2654,7 +2706,21 @@
               <w:rPr>
                 <w:rFonts w:ascii="Calibri" w:hAnsi="Calibri" w:cs="Calibri"/>
               </w:rPr>
-              <w:t>Après : photo contenue dans la page (max-width:100%)</w:t>
+              <w:t>Après : photo contenue dans la page (max-</w:t>
+            </w:r>
+            <w:proofErr w:type="gramStart"/>
+            <w:r>
+              <w:rPr>
+                <w:rFonts w:ascii="Calibri" w:hAnsi="Calibri" w:cs="Calibri"/>
+              </w:rPr>
+              <w:t>width:</w:t>
+            </w:r>
+            <w:proofErr w:type="gramEnd"/>
+            <w:r>
+              <w:rPr>
+                <w:rFonts w:ascii="Calibri" w:hAnsi="Calibri" w:cs="Calibri"/>
+              </w:rPr>
+              <w:t>100%)</w:t>
             </w:r>
           </w:p>
         </w:tc>
@@ -3419,7 +3485,25 @@
           <w:sz w:val="22"/>
           <w:szCs w:val="22"/>
         </w:rPr>
-        <w:t>Le FCP mobile reste à 2,4 s : en 4G lente simulée, le premier affichage attend toujours deux feuilles de style bloquantes, dont celle de Google Fonts sur un domaine tiers. Il faudrait héberger la police sur le site. Les en-têtes de cache (Cache-Control) ne sont pas réglables sur GitHub Pages.</w:t>
+        <w:t>Le FCP mobile reste à 2,4 s : en 4G lente simulée, le premier affichage attend toujours deux feuilles de style bloquantes, dont celle de Google Fonts sur un domaine tiers. Il faudrait héberger la police sur le site. Les</w:t>
+      </w:r>
+      <w:r>
+        <w:rPr>
+          <w:rFonts w:ascii="Calibri" w:hAnsi="Calibri" w:cs="Calibri"/>
+          <w:color w:val="1D2130"/>
+          <w:sz w:val="22"/>
+          <w:szCs w:val="22"/>
+        </w:rPr>
+        <w:t xml:space="preserve"> en</w:t>
+      </w:r>
+      <w:r>
+        <w:rPr>
+          <w:rFonts w:ascii="Calibri" w:hAnsi="Calibri" w:cs="Calibri"/>
+          <w:color w:val="1D2130"/>
+          <w:sz w:val="22"/>
+          <w:szCs w:val="22"/>
+        </w:rPr>
+        <w:t>têtes de cache (Cache-Control) ne sont pas réglables sur GitHub Pages.</w:t>
       </w:r>
     </w:p>
     <w:sectPr>

</xml_diff>